<commit_message>
commit: update student list new
</commit_message>
<xml_diff>
--- a/public/word-template/LyLichCaNhan.docx
+++ b/public/word-template/LyLichCaNhan.docx
@@ -39,9 +39,18 @@
           <w:color w:val="000000"/>
           <w:sz w:val="24"/>
           <w:szCs w:val="24"/>
-          <w:lang w:val="vi-VN"/>
-        </w:rPr>
-        <w:t>${deid}</w:t>
+        </w:rPr>
+        <w:t>$</w:t>
+      </w:r>
+      <w:r>
+        <w:rPr>
+          <w:rFonts w:ascii="Times New Roman" w:eastAsia="Times New Roman" w:hAnsi="Times New Roman" w:cs="Times New Roman"/>
+          <w:color w:val="000000"/>
+          <w:sz w:val="24"/>
+          <w:szCs w:val="24"/>
+          <w:lang w:val="vi-VN"/>
+        </w:rPr>
+        <w:t>{deid}</w:t>
       </w:r>
     </w:p>
     <w:p>
@@ -77,20 +86,34 @@
       <w:pPr>
         <w:spacing w:after="100"/>
         <w:jc w:val="center"/>
+        <w:rPr>
+          <w:sz w:val="34"/>
+          <w:szCs w:val="34"/>
+        </w:rPr>
       </w:pPr>
       <w:r>
         <w:rPr>
           <w:rStyle w:val="bold"/>
           <w:rFonts w:eastAsia="Arial"/>
+          <w:sz w:val="34"/>
+          <w:szCs w:val="34"/>
         </w:rPr>
         <w:t>LÝ LỊCH CÁ NHÂN</w:t>
       </w:r>
     </w:p>
     <w:p>
+      <w:pPr>
+        <w:rPr>
+          <w:sz w:val="26"/>
+          <w:szCs w:val="26"/>
+        </w:rPr>
+      </w:pPr>
       <w:r>
         <w:rPr>
           <w:rStyle w:val="bold"/>
           <w:rFonts w:eastAsia="Arial"/>
+          <w:sz w:val="26"/>
+          <w:szCs w:val="26"/>
         </w:rPr>
         <w:t>Thông tin cơ bản</w:t>
       </w:r>
@@ -116,29 +139,19 @@
           <w:color w:val="000000"/>
           <w:sz w:val="24"/>
           <w:szCs w:val="24"/>
-        </w:rPr>
-        <w:t xml:space="preserve">Mã GD: </w:t>
-      </w:r>
-      <w:r>
-        <w:rPr>
-          <w:rFonts w:ascii="Times New Roman" w:eastAsia="Times New Roman" w:hAnsi="Times New Roman" w:cs="Times New Roman"/>
-          <w:color w:val="000000"/>
-          <w:sz w:val="24"/>
-          <w:szCs w:val="24"/>
-          <w:lang w:val="vi-VN"/>
-        </w:rPr>
-        <w:t>${id}</w:t>
-      </w:r>
-    </w:p>
-    <w:p>
-      <w:r>
-        <w:rPr>
-          <w:rFonts w:ascii="Times New Roman" w:eastAsia="Times New Roman" w:hAnsi="Times New Roman" w:cs="Times New Roman"/>
-          <w:color w:val="000000"/>
-          <w:sz w:val="24"/>
-          <w:szCs w:val="24"/>
-        </w:rPr>
-        <w:t xml:space="preserve">Họ tên: </w:t>
+          <w:lang w:val="vi-VN"/>
+        </w:rPr>
+        <w:t>Tên thánh, h</w:t>
+      </w:r>
+      <w:r>
+        <w:rPr>
+          <w:rFonts w:ascii="Times New Roman" w:eastAsia="Times New Roman" w:hAnsi="Times New Roman" w:cs="Times New Roman"/>
+          <w:color w:val="000000"/>
+          <w:sz w:val="24"/>
+          <w:szCs w:val="24"/>
+          <w:lang w:val="vi-VN"/>
+        </w:rPr>
+        <w:t xml:space="preserve">ọ tên: </w:t>
       </w:r>
       <w:r>
         <w:rPr>
@@ -163,6 +176,7 @@
           <w:color w:val="000000"/>
           <w:sz w:val="24"/>
           <w:szCs w:val="24"/>
+          <w:lang w:val="vi-VN"/>
         </w:rPr>
         <w:t xml:space="preserve">Giới tính: </w:t>
       </w:r>
@@ -189,6 +203,7 @@
           <w:color w:val="000000"/>
           <w:sz w:val="24"/>
           <w:szCs w:val="24"/>
+          <w:lang w:val="vi-VN"/>
         </w:rPr>
         <w:t xml:space="preserve">Ngày sinh: </w:t>
       </w:r>
@@ -204,12 +219,18 @@
       </w:r>
     </w:p>
     <w:p>
-      <w:r>
-        <w:rPr>
-          <w:rFonts w:ascii="Times New Roman" w:eastAsia="Times New Roman" w:hAnsi="Times New Roman" w:cs="Times New Roman"/>
-          <w:color w:val="000000"/>
-          <w:sz w:val="24"/>
-          <w:szCs w:val="24"/>
+      <w:pPr>
+        <w:rPr>
+          <w:lang w:val="vi-VN"/>
+        </w:rPr>
+      </w:pPr>
+      <w:r>
+        <w:rPr>
+          <w:rFonts w:ascii="Times New Roman" w:eastAsia="Times New Roman" w:hAnsi="Times New Roman" w:cs="Times New Roman"/>
+          <w:color w:val="000000"/>
+          <w:sz w:val="24"/>
+          <w:szCs w:val="24"/>
+          <w:lang w:val="vi-VN"/>
         </w:rPr>
         <w:t xml:space="preserve">Nơi sinh: </w:t>
       </w:r>
@@ -229,6 +250,7 @@
           <w:color w:val="000000"/>
           <w:sz w:val="24"/>
           <w:szCs w:val="24"/>
+          <w:lang w:val="vi-VN"/>
         </w:rPr>
         <w:t>origin</w:t>
       </w:r>
@@ -255,8 +277,19 @@
           <w:color w:val="000000"/>
           <w:sz w:val="24"/>
           <w:szCs w:val="24"/>
-        </w:rPr>
-        <w:t xml:space="preserve">Cha: </w:t>
+          <w:lang w:val="vi-VN"/>
+        </w:rPr>
+        <w:t>Họ tên c</w:t>
+      </w:r>
+      <w:r>
+        <w:rPr>
+          <w:rFonts w:ascii="Times New Roman" w:eastAsia="Times New Roman" w:hAnsi="Times New Roman" w:cs="Times New Roman"/>
+          <w:color w:val="000000"/>
+          <w:sz w:val="24"/>
+          <w:szCs w:val="24"/>
+          <w:lang w:val="vi-VN"/>
+        </w:rPr>
+        <w:t xml:space="preserve">ha: </w:t>
       </w:r>
       <w:r>
         <w:rPr>
@@ -281,8 +314,19 @@
           <w:color w:val="000000"/>
           <w:sz w:val="24"/>
           <w:szCs w:val="24"/>
-        </w:rPr>
-        <w:t xml:space="preserve">Mẹ: </w:t>
+          <w:lang w:val="vi-VN"/>
+        </w:rPr>
+        <w:t>Họ tên mẹ</w:t>
+      </w:r>
+      <w:r>
+        <w:rPr>
+          <w:rFonts w:ascii="Times New Roman" w:eastAsia="Times New Roman" w:hAnsi="Times New Roman" w:cs="Times New Roman"/>
+          <w:color w:val="000000"/>
+          <w:sz w:val="24"/>
+          <w:szCs w:val="24"/>
+          <w:lang w:val="vi-VN"/>
+        </w:rPr>
+        <w:t xml:space="preserve">: </w:t>
       </w:r>
       <w:r>
         <w:rPr>
@@ -307,6 +351,7 @@
           <w:color w:val="000000"/>
           <w:sz w:val="24"/>
           <w:szCs w:val="24"/>
+          <w:lang w:val="vi-VN"/>
         </w:rPr>
         <w:t xml:space="preserve">Rửa tội ngày: </w:t>
       </w:r>
@@ -1020,7 +1065,17 @@
           <w:sz w:val="24"/>
           <w:szCs w:val="24"/>
         </w:rPr>
-        <w:t>marriage_address</w:t>
+        <w:t>marriage_</w:t>
+      </w:r>
+      <w:proofErr w:type="gramStart"/>
+      <w:r>
+        <w:rPr>
+          <w:rFonts w:ascii="Times New Roman" w:eastAsia="Times New Roman" w:hAnsi="Times New Roman" w:cs="Times New Roman"/>
+          <w:color w:val="000000"/>
+          <w:sz w:val="24"/>
+          <w:szCs w:val="24"/>
+        </w:rPr>
+        <w:t>address</w:t>
       </w:r>
       <w:r>
         <w:rPr>
@@ -1040,6 +1095,112 @@
           <w:szCs w:val="24"/>
           <w:lang w:val="vi-VN"/>
         </w:rPr>
+        <w:t>$</w:t>
+      </w:r>
+      <w:proofErr w:type="gramEnd"/>
+      <w:r>
+        <w:rPr>
+          <w:rFonts w:ascii="Times New Roman" w:eastAsia="Times New Roman" w:hAnsi="Times New Roman" w:cs="Times New Roman"/>
+          <w:color w:val="000000"/>
+          <w:sz w:val="24"/>
+          <w:szCs w:val="24"/>
+          <w:lang w:val="vi-VN"/>
+        </w:rPr>
+        <w:t>{</w:t>
+      </w:r>
+      <w:r>
+        <w:rPr>
+          <w:rFonts w:ascii="Times New Roman" w:eastAsia="Times New Roman" w:hAnsi="Times New Roman" w:cs="Times New Roman"/>
+          <w:color w:val="000000"/>
+          <w:sz w:val="24"/>
+          <w:szCs w:val="24"/>
+        </w:rPr>
+        <w:t>marriage_</w:t>
+      </w:r>
+      <w:proofErr w:type="gramStart"/>
+      <w:r>
+        <w:rPr>
+          <w:rFonts w:ascii="Times New Roman" w:eastAsia="Times New Roman" w:hAnsi="Times New Roman" w:cs="Times New Roman"/>
+          <w:color w:val="000000"/>
+          <w:sz w:val="24"/>
+          <w:szCs w:val="24"/>
+        </w:rPr>
+        <w:t>ward</w:t>
+      </w:r>
+      <w:r>
+        <w:rPr>
+          <w:rFonts w:ascii="Times New Roman" w:eastAsia="Times New Roman" w:hAnsi="Times New Roman" w:cs="Times New Roman"/>
+          <w:color w:val="000000"/>
+          <w:sz w:val="24"/>
+          <w:szCs w:val="24"/>
+          <w:lang w:val="vi-VN"/>
+        </w:rPr>
+        <w:t>}</w:t>
+      </w:r>
+      <w:r>
+        <w:rPr>
+          <w:rFonts w:ascii="Times New Roman" w:eastAsia="Times New Roman" w:hAnsi="Times New Roman" w:cs="Times New Roman"/>
+          <w:color w:val="000000"/>
+          <w:sz w:val="24"/>
+          <w:szCs w:val="24"/>
+          <w:lang w:val="vi-VN"/>
+        </w:rPr>
+        <w:t>$</w:t>
+      </w:r>
+      <w:proofErr w:type="gramEnd"/>
+      <w:r>
+        <w:rPr>
+          <w:rFonts w:ascii="Times New Roman" w:eastAsia="Times New Roman" w:hAnsi="Times New Roman" w:cs="Times New Roman"/>
+          <w:color w:val="000000"/>
+          <w:sz w:val="24"/>
+          <w:szCs w:val="24"/>
+          <w:lang w:val="vi-VN"/>
+        </w:rPr>
+        <w:t>{</w:t>
+      </w:r>
+      <w:r>
+        <w:rPr>
+          <w:rFonts w:ascii="Times New Roman" w:eastAsia="Times New Roman" w:hAnsi="Times New Roman" w:cs="Times New Roman"/>
+          <w:color w:val="000000"/>
+          <w:sz w:val="24"/>
+          <w:szCs w:val="24"/>
+        </w:rPr>
+        <w:t>marriage_province</w:t>
+      </w:r>
+      <w:r>
+        <w:rPr>
+          <w:rFonts w:ascii="Times New Roman" w:eastAsia="Times New Roman" w:hAnsi="Times New Roman" w:cs="Times New Roman"/>
+          <w:color w:val="000000"/>
+          <w:sz w:val="24"/>
+          <w:szCs w:val="24"/>
+          <w:lang w:val="vi-VN"/>
+        </w:rPr>
+        <w:t>}</w:t>
+      </w:r>
+    </w:p>
+    <w:p>
+      <w:pPr>
+        <w:rPr>
+          <w:lang w:val="vi-VN"/>
+        </w:rPr>
+      </w:pPr>
+      <w:r>
+        <w:rPr>
+          <w:rFonts w:ascii="Times New Roman" w:eastAsia="Times New Roman" w:hAnsi="Times New Roman" w:cs="Times New Roman"/>
+          <w:color w:val="000000"/>
+          <w:sz w:val="24"/>
+          <w:szCs w:val="24"/>
+        </w:rPr>
+        <w:t xml:space="preserve">Do: </w:t>
+      </w:r>
+      <w:r>
+        <w:rPr>
+          <w:rFonts w:ascii="Times New Roman" w:eastAsia="Times New Roman" w:hAnsi="Times New Roman" w:cs="Times New Roman"/>
+          <w:color w:val="000000"/>
+          <w:sz w:val="24"/>
+          <w:szCs w:val="24"/>
+          <w:lang w:val="vi-VN"/>
+        </w:rPr>
         <w:t>${</w:t>
       </w:r>
       <w:r>
@@ -1049,7 +1210,7 @@
           <w:sz w:val="24"/>
           <w:szCs w:val="24"/>
         </w:rPr>
-        <w:t>marriage_ward</w:t>
+        <w:t>priest</w:t>
       </w:r>
       <w:r>
         <w:rPr>
@@ -1061,6 +1222,22 @@
         </w:rPr>
         <w:t>}</w:t>
       </w:r>
+    </w:p>
+    <w:p>
+      <w:pPr>
+        <w:rPr>
+          <w:lang w:val="vi-VN"/>
+        </w:rPr>
+      </w:pPr>
+      <w:r>
+        <w:rPr>
+          <w:rFonts w:ascii="Times New Roman" w:eastAsia="Times New Roman" w:hAnsi="Times New Roman" w:cs="Times New Roman"/>
+          <w:color w:val="000000"/>
+          <w:sz w:val="24"/>
+          <w:szCs w:val="24"/>
+        </w:rPr>
+        <w:t xml:space="preserve">Người chứng 1: </w:t>
+      </w:r>
       <w:r>
         <w:rPr>
           <w:rFonts w:ascii="Times New Roman" w:eastAsia="Times New Roman" w:hAnsi="Times New Roman" w:cs="Times New Roman"/>
@@ -1078,7 +1255,7 @@
           <w:sz w:val="24"/>
           <w:szCs w:val="24"/>
         </w:rPr>
-        <w:t>marriage_province</w:t>
+        <w:t>peopleone</w:t>
       </w:r>
       <w:r>
         <w:rPr>
@@ -1103,8 +1280,9 @@
           <w:color w:val="000000"/>
           <w:sz w:val="24"/>
           <w:szCs w:val="24"/>
-        </w:rPr>
-        <w:t xml:space="preserve">Do: </w:t>
+          <w:lang w:val="vi-VN"/>
+        </w:rPr>
+        <w:t xml:space="preserve">Người chứng 2: </w:t>
       </w:r>
       <w:r>
         <w:rPr>
@@ -1122,8 +1300,9 @@
           <w:color w:val="000000"/>
           <w:sz w:val="24"/>
           <w:szCs w:val="24"/>
-        </w:rPr>
-        <w:t>priest</w:t>
+          <w:lang w:val="vi-VN"/>
+        </w:rPr>
+        <w:t>peopletwo</w:t>
       </w:r>
       <w:r>
         <w:rPr>
@@ -1148,8 +1327,9 @@
           <w:color w:val="000000"/>
           <w:sz w:val="24"/>
           <w:szCs w:val="24"/>
-        </w:rPr>
-        <w:t xml:space="preserve">Người chứng 1: </w:t>
+          <w:lang w:val="vi-VN"/>
+        </w:rPr>
+        <w:t xml:space="preserve">Tình trạng: </w:t>
       </w:r>
       <w:r>
         <w:rPr>
@@ -1167,8 +1347,9 @@
           <w:color w:val="000000"/>
           <w:sz w:val="24"/>
           <w:szCs w:val="24"/>
-        </w:rPr>
-        <w:t>peopleone</w:t>
+          <w:lang w:val="vi-VN"/>
+        </w:rPr>
+        <w:t>tinhtrang</w:t>
       </w:r>
       <w:r>
         <w:rPr>
@@ -1183,102 +1364,18 @@
     </w:p>
     <w:p>
       <w:pPr>
-        <w:rPr>
-          <w:lang w:val="vi-VN"/>
-        </w:rPr>
-      </w:pPr>
-      <w:r>
-        <w:rPr>
-          <w:rFonts w:ascii="Times New Roman" w:eastAsia="Times New Roman" w:hAnsi="Times New Roman" w:cs="Times New Roman"/>
-          <w:color w:val="000000"/>
-          <w:sz w:val="24"/>
-          <w:szCs w:val="24"/>
-        </w:rPr>
-        <w:t xml:space="preserve">Người chứng 2: </w:t>
-      </w:r>
-      <w:r>
-        <w:rPr>
-          <w:rFonts w:ascii="Times New Roman" w:eastAsia="Times New Roman" w:hAnsi="Times New Roman" w:cs="Times New Roman"/>
-          <w:color w:val="000000"/>
-          <w:sz w:val="24"/>
-          <w:szCs w:val="24"/>
-          <w:lang w:val="vi-VN"/>
-        </w:rPr>
-        <w:t>${</w:t>
-      </w:r>
-      <w:r>
-        <w:rPr>
-          <w:rFonts w:ascii="Times New Roman" w:eastAsia="Times New Roman" w:hAnsi="Times New Roman" w:cs="Times New Roman"/>
-          <w:color w:val="000000"/>
-          <w:sz w:val="24"/>
-          <w:szCs w:val="24"/>
-        </w:rPr>
-        <w:t>peopletwo</w:t>
-      </w:r>
-      <w:r>
-        <w:rPr>
-          <w:rFonts w:ascii="Times New Roman" w:eastAsia="Times New Roman" w:hAnsi="Times New Roman" w:cs="Times New Roman"/>
-          <w:color w:val="000000"/>
-          <w:sz w:val="24"/>
-          <w:szCs w:val="24"/>
-          <w:lang w:val="vi-VN"/>
-        </w:rPr>
-        <w:t>}</w:t>
-      </w:r>
-    </w:p>
-    <w:p>
-      <w:pPr>
-        <w:rPr>
-          <w:lang w:val="vi-VN"/>
-        </w:rPr>
-      </w:pPr>
-      <w:r>
-        <w:rPr>
-          <w:rFonts w:ascii="Times New Roman" w:eastAsia="Times New Roman" w:hAnsi="Times New Roman" w:cs="Times New Roman"/>
-          <w:color w:val="000000"/>
-          <w:sz w:val="24"/>
-          <w:szCs w:val="24"/>
-        </w:rPr>
-        <w:t xml:space="preserve">Tình trạng: </w:t>
-      </w:r>
-      <w:r>
-        <w:rPr>
-          <w:rFonts w:ascii="Times New Roman" w:eastAsia="Times New Roman" w:hAnsi="Times New Roman" w:cs="Times New Roman"/>
-          <w:color w:val="000000"/>
-          <w:sz w:val="24"/>
-          <w:szCs w:val="24"/>
-          <w:lang w:val="vi-VN"/>
-        </w:rPr>
-        <w:t>${</w:t>
-      </w:r>
-      <w:r>
-        <w:rPr>
-          <w:rFonts w:ascii="Times New Roman" w:eastAsia="Times New Roman" w:hAnsi="Times New Roman" w:cs="Times New Roman"/>
-          <w:color w:val="000000"/>
-          <w:sz w:val="24"/>
-          <w:szCs w:val="24"/>
-        </w:rPr>
-        <w:t>tinhtrang</w:t>
-      </w:r>
-      <w:r>
-        <w:rPr>
-          <w:rFonts w:ascii="Times New Roman" w:eastAsia="Times New Roman" w:hAnsi="Times New Roman" w:cs="Times New Roman"/>
-          <w:color w:val="000000"/>
-          <w:sz w:val="24"/>
-          <w:szCs w:val="24"/>
-          <w:lang w:val="vi-VN"/>
-        </w:rPr>
-        <w:t>}</w:t>
-      </w:r>
-    </w:p>
-    <w:p>
-      <w:pPr>
         <w:spacing w:after="120"/>
+        <w:rPr>
+          <w:lang w:val="vi-VN"/>
+        </w:rPr>
       </w:pPr>
     </w:p>
     <w:p>
       <w:pPr>
         <w:spacing w:after="120"/>
+        <w:rPr>
+          <w:lang w:val="vi-VN"/>
+        </w:rPr>
         <w:sectPr>
           <w:type w:val="continuous"/>
           <w:pgSz w:w="11905" w:h="16837"/>
@@ -1290,11 +1387,19 @@
     <w:p>
       <w:pPr>
         <w:spacing w:after="120"/>
+        <w:rPr>
+          <w:sz w:val="26"/>
+          <w:szCs w:val="26"/>
+          <w:lang w:val="vi-VN"/>
+        </w:rPr>
       </w:pPr>
       <w:r>
         <w:rPr>
           <w:rStyle w:val="bold"/>
           <w:rFonts w:eastAsia="Arial"/>
+          <w:sz w:val="26"/>
+          <w:szCs w:val="26"/>
+          <w:lang w:val="vi-VN"/>
         </w:rPr>
         <w:t>Thông tin khác</w:t>
       </w:r>
@@ -1302,6 +1407,9 @@
     <w:p>
       <w:pPr>
         <w:spacing w:after="120"/>
+        <w:rPr>
+          <w:lang w:val="vi-VN"/>
+        </w:rPr>
         <w:sectPr>
           <w:type w:val="continuous"/>
           <w:pgSz w:w="11905" w:h="16837"/>
@@ -1313,13 +1421,17 @@
     <w:p>
       <w:pPr>
         <w:spacing w:after="120"/>
-      </w:pPr>
-      <w:r>
-        <w:rPr>
-          <w:rFonts w:ascii="Times New Roman" w:eastAsia="Times New Roman" w:hAnsi="Times New Roman" w:cs="Times New Roman"/>
-          <w:color w:val="000000"/>
-          <w:sz w:val="24"/>
-          <w:szCs w:val="24"/>
+        <w:rPr>
+          <w:lang w:val="vi-VN"/>
+        </w:rPr>
+      </w:pPr>
+      <w:r>
+        <w:rPr>
+          <w:rFonts w:ascii="Times New Roman" w:eastAsia="Times New Roman" w:hAnsi="Times New Roman" w:cs="Times New Roman"/>
+          <w:color w:val="000000"/>
+          <w:sz w:val="24"/>
+          <w:szCs w:val="24"/>
+          <w:lang w:val="vi-VN"/>
         </w:rPr>
         <w:t>Địa chỉ:</w:t>
       </w:r>
@@ -1349,6 +1461,7 @@
           <w:color w:val="000000"/>
           <w:sz w:val="24"/>
           <w:szCs w:val="24"/>
+          <w:lang w:val="vi-VN"/>
         </w:rPr>
         <w:t>residence</w:t>
       </w:r>
@@ -1378,6 +1491,7 @@
           <w:color w:val="000000"/>
           <w:sz w:val="24"/>
           <w:szCs w:val="24"/>
+          <w:lang w:val="vi-VN"/>
         </w:rPr>
         <w:t>resi_ward</w:t>
       </w:r>
@@ -1417,6 +1531,7 @@
           <w:color w:val="000000"/>
           <w:sz w:val="24"/>
           <w:szCs w:val="24"/>
+          <w:lang w:val="vi-VN"/>
         </w:rPr>
         <w:t>resi_province</w:t>
       </w:r>
@@ -1436,6 +1551,7 @@
           <w:color w:val="000000"/>
           <w:sz w:val="24"/>
           <w:szCs w:val="24"/>
+          <w:lang w:val="vi-VN"/>
         </w:rPr>
         <w:t xml:space="preserve"> </w:t>
       </w:r>
@@ -1463,6 +1579,7 @@
           <w:color w:val="000000"/>
           <w:sz w:val="24"/>
           <w:szCs w:val="24"/>
+          <w:lang w:val="vi-VN"/>
         </w:rPr>
         <w:t>phone</w:t>
       </w:r>
@@ -1508,6 +1625,7 @@
           <w:color w:val="000000"/>
           <w:sz w:val="24"/>
           <w:szCs w:val="24"/>
+          <w:lang w:val="vi-VN"/>
         </w:rPr>
         <w:t xml:space="preserve">Nghề nghiệp: </w:t>
       </w:r>
@@ -1527,6 +1645,7 @@
           <w:color w:val="000000"/>
           <w:sz w:val="24"/>
           <w:szCs w:val="24"/>
+          <w:lang w:val="vi-VN"/>
         </w:rPr>
         <w:t>career</w:t>
       </w:r>
@@ -1554,6 +1673,7 @@
           <w:color w:val="000000"/>
           <w:sz w:val="24"/>
           <w:szCs w:val="24"/>
+          <w:lang w:val="vi-VN"/>
         </w:rPr>
         <w:t xml:space="preserve">Trình độ văn hóa: </w:t>
       </w:r>
@@ -1573,6 +1693,7 @@
           <w:color w:val="000000"/>
           <w:sz w:val="24"/>
           <w:szCs w:val="24"/>
+          <w:lang w:val="vi-VN"/>
         </w:rPr>
         <w:t>level</w:t>
       </w:r>
@@ -1610,6 +1731,7 @@
           <w:color w:val="000000"/>
           <w:sz w:val="24"/>
           <w:szCs w:val="24"/>
+          <w:lang w:val="vi-VN"/>
         </w:rPr>
         <w:t>married</w:t>
       </w:r>
@@ -1647,6 +1769,7 @@
           <w:color w:val="000000"/>
           <w:sz w:val="24"/>
           <w:szCs w:val="24"/>
+          <w:lang w:val="vi-VN"/>
         </w:rPr>
         <w:t>die_time</w:t>
       </w:r>
@@ -1714,6 +1837,7 @@
           <w:color w:val="000000"/>
           <w:sz w:val="24"/>
           <w:szCs w:val="24"/>
+          <w:lang w:val="vi-VN"/>
         </w:rPr>
         <w:t xml:space="preserve"> </w:t>
       </w:r>
@@ -1761,10 +1885,16 @@
     <w:p>
       <w:pPr>
         <w:spacing w:after="120"/>
-      </w:pPr>
-    </w:p>
-    <w:p>
-      <w:pPr>
+        <w:rPr>
+          <w:lang w:val="vi-VN"/>
+        </w:rPr>
+      </w:pPr>
+    </w:p>
+    <w:p>
+      <w:pPr>
+        <w:rPr>
+          <w:lang w:val="vi-VN"/>
+        </w:rPr>
         <w:sectPr>
           <w:type w:val="continuous"/>
           <w:pgSz w:w="11905" w:h="16837"/>
@@ -1780,6 +1910,7 @@
         <w:rPr>
           <w:i/>
           <w:iCs/>
+          <w:lang w:val="vi-VN"/>
         </w:rPr>
       </w:pPr>
       <w:r>
@@ -1826,6 +1957,7 @@
           <w:color w:val="000000"/>
           <w:sz w:val="24"/>
           <w:szCs w:val="24"/>
+          <w:lang w:val="vi-VN"/>
         </w:rPr>
         <w:t xml:space="preserve">, ngày </w:t>
       </w:r>
@@ -1849,6 +1981,7 @@
           <w:color w:val="000000"/>
           <w:sz w:val="24"/>
           <w:szCs w:val="24"/>
+          <w:lang w:val="vi-VN"/>
         </w:rPr>
         <w:t xml:space="preserve">, tháng </w:t>
       </w:r>
@@ -1872,6 +2005,7 @@
           <w:color w:val="000000"/>
           <w:sz w:val="24"/>
           <w:szCs w:val="24"/>
+          <w:lang w:val="vi-VN"/>
         </w:rPr>
         <w:t xml:space="preserve">, năm </w:t>
       </w:r>
@@ -1895,12 +2029,16 @@
           <w:color w:val="000000"/>
           <w:sz w:val="24"/>
           <w:szCs w:val="24"/>
+          <w:lang w:val="vi-VN"/>
         </w:rPr>
         <w:t>.</w:t>
       </w:r>
     </w:p>
     <w:p>
       <w:pPr>
+        <w:rPr>
+          <w:lang w:val="vi-VN"/>
+        </w:rPr>
         <w:sectPr>
           <w:type w:val="continuous"/>
           <w:pgSz w:w="11905" w:h="16837"/>
@@ -1909,11 +2047,16 @@
         </w:sectPr>
       </w:pPr>
     </w:p>
-    <w:p/>
+    <w:p>
+      <w:pPr>
+        <w:rPr>
+          <w:lang w:val="vi-VN"/>
+        </w:rPr>
+      </w:pPr>
+    </w:p>
     <w:p>
       <w:pPr>
         <w:spacing w:after="100"/>
-        <w:jc w:val="center"/>
         <w:sectPr>
           <w:type w:val="continuous"/>
           <w:pgSz w:w="11905" w:h="16837"/>
@@ -1928,6 +2071,15 @@
           <w:sz w:val="24"/>
           <w:szCs w:val="24"/>
         </w:rPr>
+        <w:t xml:space="preserve">                   </w:t>
+      </w:r>
+      <w:r>
+        <w:rPr>
+          <w:rFonts w:ascii="Times New Roman" w:eastAsia="Times New Roman" w:hAnsi="Times New Roman" w:cs="Times New Roman"/>
+          <w:color w:val="000000"/>
+          <w:sz w:val="24"/>
+          <w:szCs w:val="24"/>
+        </w:rPr>
         <w:t>Linh mụ</w:t>
       </w:r>
       <w:r>
@@ -1938,6 +2090,134 @@
           <w:szCs w:val="24"/>
         </w:rPr>
         <w:t>c</w:t>
+      </w:r>
+    </w:p>
+    <w:p>
+      <w:r>
+        <w:tab/>
+      </w:r>
+      <w:r>
+        <w:tab/>
+      </w:r>
+      <w:r>
+        <w:tab/>
+      </w:r>
+      <w:r>
+        <w:tab/>
+      </w:r>
+      <w:r>
+        <w:tab/>
+      </w:r>
+      <w:r>
+        <w:tab/>
+      </w:r>
+      <w:r>
+        <w:tab/>
+      </w:r>
+      <w:r>
+        <w:tab/>
+      </w:r>
+    </w:p>
+    <w:p>
+      <w:r>
+        <w:tab/>
+      </w:r>
+      <w:r>
+        <w:tab/>
+      </w:r>
+      <w:r>
+        <w:tab/>
+      </w:r>
+      <w:r>
+        <w:tab/>
+      </w:r>
+      <w:r>
+        <w:tab/>
+      </w:r>
+      <w:r>
+        <w:tab/>
+      </w:r>
+      <w:r>
+        <w:tab/>
+      </w:r>
+      <w:r>
+        <w:tab/>
+        <w:t xml:space="preserve">         </w:t>
+      </w:r>
+      <w:r>
+        <w:rPr>
+          <w:rFonts w:ascii="Times New Roman" w:eastAsia="Times New Roman" w:hAnsi="Times New Roman" w:cs="Times New Roman"/>
+          <w:color w:val="000000"/>
+          <w:sz w:val="24"/>
+          <w:szCs w:val="24"/>
+          <w:lang w:val="vi-VN"/>
+        </w:rPr>
+        <w:t>${parish_priest}</w:t>
+      </w:r>
+      <w:r>
+        <w:rPr>
+          <w:rFonts w:ascii="Times New Roman" w:eastAsia="Times New Roman" w:hAnsi="Times New Roman" w:cs="Times New Roman"/>
+          <w:color w:val="000000"/>
+          <w:sz w:val="24"/>
+          <w:szCs w:val="24"/>
+          <w:lang w:val="vi-VN"/>
+        </w:rPr>
+        <w:tab/>
+      </w:r>
+      <w:r>
+        <w:rPr>
+          <w:rFonts w:ascii="Times New Roman" w:eastAsia="Times New Roman" w:hAnsi="Times New Roman" w:cs="Times New Roman"/>
+          <w:color w:val="000000"/>
+          <w:sz w:val="24"/>
+          <w:szCs w:val="24"/>
+          <w:lang w:val="vi-VN"/>
+        </w:rPr>
+        <w:tab/>
+      </w:r>
+    </w:p>
+    <w:p>
+      <w:r>
+        <w:lastRenderedPageBreak/>
+        <w:tab/>
+      </w:r>
+      <w:r>
+        <w:tab/>
+      </w:r>
+      <w:r>
+        <w:tab/>
+      </w:r>
+      <w:r>
+        <w:tab/>
+      </w:r>
+      <w:r>
+        <w:tab/>
+      </w:r>
+      <w:r>
+        <w:tab/>
+      </w:r>
+      <w:r>
+        <w:tab/>
+      </w:r>
+      <w:r>
+        <w:tab/>
+      </w:r>
+      <w:r>
+        <w:tab/>
+      </w:r>
+      <w:r>
+        <w:tab/>
+      </w:r>
+      <w:r>
+        <w:tab/>
+      </w:r>
+      <w:r>
+        <w:tab/>
+      </w:r>
+      <w:r>
+        <w:tab/>
+      </w:r>
+      <w:r>
+        <w:tab/>
       </w:r>
     </w:p>
     <w:p/>

</xml_diff>